<commit_message>
Add structured classroom activity types
</commit_message>
<xml_diff>
--- a/plans/5th Grade Technology/5th Grade Monthly Planning/2nd Trimester/5° Technology - August.docx
+++ b/plans/5th Grade Technology/5th Grade Monthly Planning/2nd Trimester/5° Technology - August.docx
@@ -331,11 +331,11 @@
             <w:r>
               <w:t>Competences:</w:t>
               <w:br/>
-              <w:t>• Explain how inputs, conditions, choices, and outputs work in simple everyday and computer-style examples.</w:t>
-              <w:br/>
-              <w:t>• Test and debug short if-then routines using cards, Scratch, Blockly, or paper fallback options.</w:t>
-              <w:br/>
-              <w:t>• Organize Trimester 2 evidence and complete make-up work without adding new graded content after Week 9.</w:t>
+              <w:t>Explain how inputs, conditions, choices, and outputs work in simple everyday and computer-style examples.</w:t>
+              <w:br/>
+              <w:t>Test and debug short if-then routines using cards, Scratch, Blockly, or paper fallback options.</w:t>
+              <w:br/>
+              <w:t>Design a low-risk simulated STEM routine with one input, one condition, one output, and one test result.</w:t>
             </w:r>
           </w:p>
         </w:tc>
@@ -350,11 +350,11 @@
             <w:r>
               <w:t>Learning Objectives:</w:t>
               <w:br/>
-              <w:t>• Identify inputs, outputs, conditions, choices, true/false results, and simple logic errors.</w:t>
-              <w:br/>
-              <w:t>• Complete and correct if-then examples with visible condition and output labels.</w:t>
-              <w:br/>
-              <w:t>• Create a short logic demo and prepare Trimester 2 review or make-up evidence.</w:t>
+              <w:t>Identify inputs, outputs, conditions, choices, true/false results, and simple logic errors.</w:t>
+              <w:br/>
+              <w:t>Complete and correct if-then examples with visible condition and output labels.</w:t>
+              <w:br/>
+              <w:t>Create a short Interactive Routine STEM Project and prepare Trimester 2 review or make-up evidence.</w:t>
             </w:r>
           </w:p>
         </w:tc>
@@ -369,11 +369,11 @@
             <w:r>
               <w:t>Learning Outcomes:</w:t>
               <w:br/>
-              <w:t>• Complete Summative Activity #5: selection and debugging check in Week 9.</w:t>
-              <w:br/>
-              <w:t>• Complete formative if-then practice, logic demo, review game, and evidence workshop tasks.</w:t>
-              <w:br/>
-              <w:t>• Use Week 13 only for exam-week quiet review, organization, or school-directed tasks.</w:t>
+              <w:t>Complete Summative Activity #5: Interactive Routine STEM Project in Week 11.</w:t>
+              <w:br/>
+              <w:t>Complete formative if-then practice, debugging preparation, review game, and evidence workshop tasks.</w:t>
+              <w:br/>
+              <w:t>Use Week 13 only for exam-week quiet review, organization, or school-directed tasks.</w:t>
             </w:r>
           </w:p>
         </w:tc>
@@ -734,98 +734,111 @@
                 <w:szCs w:val="24"/>
               </w:rPr>
               <w:t>Topic:</w:t>
-            </w:r>
-            <w:r>
-              <w:rPr>
-                <w:sz w:val="24"/>
-                <w:szCs w:val="24"/>
-              </w:rPr>
-              <w:br/>
-              <w:t>Selection and Debugging Check</w:t>
-            </w:r>
-            <w:r>
-              <w:rPr>
-                <w:sz w:val="24"/>
-                <w:szCs w:val="24"/>
-              </w:rPr>
-              <w:br/>
-            </w:r>
-            <w:r>
-              <w:rPr>
-                <w:b/>
-                <w:sz w:val="24"/>
-                <w:szCs w:val="24"/>
-              </w:rPr>
+              <w:br/>
+              <w:t>Selection and Debugging Preparation</w:t>
+              <w:br/>
               <w:t>Pre-Activities:</w:t>
-            </w:r>
-            <w:r>
-              <w:rPr>
-                <w:sz w:val="24"/>
-                <w:szCs w:val="24"/>
-              </w:rPr>
-              <w:br/>
-            </w:r>
-            <w:r>
-              <w:rPr>
-                <w:b/>
-                <w:sz w:val="24"/>
-                <w:szCs w:val="24"/>
-              </w:rPr>
+              <w:br/>
               <w:t>Practice Keywords:</w:t>
-            </w:r>
-            <w:r>
-              <w:rPr>
-                <w:sz w:val="24"/>
-                <w:szCs w:val="24"/>
-              </w:rPr>
               <w:br/>
               <w:t>selection: choosing an action based on a condition</w:t>
-            </w:r>
-            <w:r>
-              <w:rPr>
-                <w:sz w:val="24"/>
-                <w:szCs w:val="24"/>
-              </w:rPr>
               <w:br/>
               <w:t>debug: to find and correct an error</w:t>
-            </w:r>
-            <w:r>
-              <w:rPr>
-                <w:sz w:val="24"/>
-                <w:szCs w:val="24"/>
-              </w:rPr>
               <w:br/>
               <w:t>Review condition, action, true, false, and debug.</w:t>
-            </w:r>
-            <w:r>
-              <w:rPr>
-                <w:sz w:val="24"/>
-                <w:szCs w:val="24"/>
-              </w:rPr>
               <w:br/>
               <w:t>Practice finding the error in one sample command.</w:t>
-            </w:r>
-            <w:r>
-              <w:rPr>
-                <w:sz w:val="24"/>
-                <w:szCs w:val="24"/>
-              </w:rPr>
-              <w:br/>
-            </w:r>
-            <w:r>
-              <w:rPr>
-                <w:b/>
-                <w:sz w:val="24"/>
-                <w:szCs w:val="24"/>
-              </w:rPr>
+              <w:br/>
               <w:t>While-Activities:</w:t>
-            </w:r>
-            <w:r>
-              <w:rPr>
-                <w:sz w:val="24"/>
-                <w:szCs w:val="24"/>
-              </w:rPr>
-              <w:br/>
+              <w:br/>
+              <w:t>Complete a formative selection and debugging practice check with 6 if-then examples, 4 input-output matches, and 2 simple command errors to correct.</w:t>
+              <w:br/>
+              <w:t>Label each condition and output clearly.</w:t>
+              <w:br/>
+              <w:t>Post-Activities:</w:t>
+              <w:br/>
+              <w:t>Submit practice evidence.</w:t>
+              <w:br/>
+              <w:t>Write one debugging habit you used.</w:t>
+              <w:br/>
+              <w:t>Resources:</w:t>
+              <w:br/>
+              <w:t>notebook, logic cards, worksheet, paper fallback.</w:t>
+            </w:r>
+            <w:r>
+              <w:rPr>
+                <w:sz w:val="24"/>
+                <w:szCs w:val="24"/>
+              </w:rPr>
+            </w:r>
+            <w:r>
+              <w:rPr>
+                <w:sz w:val="24"/>
+                <w:szCs w:val="24"/>
+              </w:rPr>
+            </w:r>
+            <w:r>
+              <w:rPr>
+                <w:b/>
+                <w:sz w:val="24"/>
+                <w:szCs w:val="24"/>
+              </w:rPr>
+            </w:r>
+            <w:r>
+              <w:rPr>
+                <w:sz w:val="24"/>
+                <w:szCs w:val="24"/>
+              </w:rPr>
+            </w:r>
+            <w:r>
+              <w:rPr>
+                <w:b/>
+                <w:sz w:val="24"/>
+                <w:szCs w:val="24"/>
+              </w:rPr>
+            </w:r>
+            <w:r>
+              <w:rPr>
+                <w:sz w:val="24"/>
+                <w:szCs w:val="24"/>
+              </w:rPr>
+            </w:r>
+            <w:r>
+              <w:rPr>
+                <w:sz w:val="24"/>
+                <w:szCs w:val="24"/>
+              </w:rPr>
+            </w:r>
+            <w:r>
+              <w:rPr>
+                <w:sz w:val="24"/>
+                <w:szCs w:val="24"/>
+              </w:rPr>
+            </w:r>
+            <w:r>
+              <w:rPr>
+                <w:sz w:val="24"/>
+                <w:szCs w:val="24"/>
+              </w:rPr>
+            </w:r>
+            <w:r>
+              <w:rPr>
+                <w:sz w:val="24"/>
+                <w:szCs w:val="24"/>
+              </w:rPr>
+            </w:r>
+            <w:r>
+              <w:rPr>
+                <w:b/>
+                <w:sz w:val="24"/>
+                <w:szCs w:val="24"/>
+              </w:rPr>
+            </w:r>
+            <w:r>
+              <w:rPr>
+                <w:sz w:val="24"/>
+                <w:szCs w:val="24"/>
+              </w:rPr>
             </w:r>
             <w:r>
               <w:rPr>
@@ -833,7 +846,6 @@
                 <w:szCs w:val="24"/>
                 <w:highlight w:val="yellow"/>
               </w:rPr>
-              <w:t>Complete Summative Activity #5 (Summative): Finish a selection and debugging check with 6 if-then examples, 4 input-output matches, and 2 simple command errors to correct.</w:t>
             </w:r>
             <w:r>
               <w:rPr>
@@ -841,68 +853,56 @@
                 <w:szCs w:val="24"/>
                 <w:highlight w:val="yellow"/>
               </w:rPr>
-              <w:br/>
-            </w:r>
-            <w:r>
-              <w:rPr>
-                <w:sz w:val="24"/>
-                <w:szCs w:val="24"/>
-              </w:rPr>
-              <w:t>Label each condition and output clearly.</w:t>
-            </w:r>
-            <w:r>
-              <w:rPr>
-                <w:sz w:val="24"/>
-                <w:szCs w:val="24"/>
-              </w:rPr>
-              <w:br/>
-            </w:r>
-            <w:r>
-              <w:rPr>
-                <w:b/>
-                <w:sz w:val="24"/>
-                <w:szCs w:val="24"/>
-              </w:rPr>
-              <w:t>Post-Activities:</w:t>
-            </w:r>
-            <w:r>
-              <w:rPr>
-                <w:sz w:val="24"/>
-                <w:szCs w:val="24"/>
-              </w:rPr>
-              <w:br/>
-              <w:t>Submit your check.</w:t>
-            </w:r>
-            <w:r>
-              <w:rPr>
-                <w:sz w:val="24"/>
-                <w:szCs w:val="24"/>
-              </w:rPr>
-              <w:br/>
-              <w:t>Write one debugging habit you used.</w:t>
-            </w:r>
-            <w:r>
-              <w:rPr>
-                <w:sz w:val="24"/>
-                <w:szCs w:val="24"/>
-              </w:rPr>
-              <w:br/>
-            </w:r>
-            <w:r>
-              <w:rPr>
-                <w:b/>
-                <w:sz w:val="24"/>
-                <w:szCs w:val="24"/>
-              </w:rPr>
-              <w:t>Resources:</w:t>
-            </w:r>
-            <w:r>
-              <w:rPr>
-                <w:sz w:val="24"/>
-                <w:szCs w:val="24"/>
-              </w:rPr>
-              <w:br/>
-              <w:t>notebook, logic cards, worksheet, paper fallback.</w:t>
+            </w:r>
+            <w:r>
+              <w:rPr>
+                <w:sz w:val="24"/>
+                <w:szCs w:val="24"/>
+              </w:rPr>
+            </w:r>
+            <w:r>
+              <w:rPr>
+                <w:sz w:val="24"/>
+                <w:szCs w:val="24"/>
+              </w:rPr>
+            </w:r>
+            <w:r>
+              <w:rPr>
+                <w:b/>
+                <w:sz w:val="24"/>
+                <w:szCs w:val="24"/>
+              </w:rPr>
+            </w:r>
+            <w:r>
+              <w:rPr>
+                <w:sz w:val="24"/>
+                <w:szCs w:val="24"/>
+              </w:rPr>
+            </w:r>
+            <w:r>
+              <w:rPr>
+                <w:sz w:val="24"/>
+                <w:szCs w:val="24"/>
+              </w:rPr>
+            </w:r>
+            <w:r>
+              <w:rPr>
+                <w:sz w:val="24"/>
+                <w:szCs w:val="24"/>
+              </w:rPr>
+            </w:r>
+            <w:r>
+              <w:rPr>
+                <w:b/>
+                <w:sz w:val="24"/>
+                <w:szCs w:val="24"/>
+              </w:rPr>
+            </w:r>
+            <w:r>
+              <w:rPr>
+                <w:sz w:val="24"/>
+                <w:szCs w:val="24"/>
+              </w:rPr>
             </w:r>
           </w:p>
         </w:tc>
@@ -1223,169 +1223,169 @@
                 <w:szCs w:val="24"/>
               </w:rPr>
               <w:t>Topic:</w:t>
-            </w:r>
-            <w:r>
-              <w:rPr>
-                <w:sz w:val="24"/>
-                <w:szCs w:val="24"/>
-              </w:rPr>
               <w:br/>
               <w:t>Selection Practice and Debugging Review</w:t>
-            </w:r>
-            <w:r>
-              <w:rPr>
-                <w:sz w:val="24"/>
-                <w:szCs w:val="24"/>
-              </w:rPr>
-              <w:br/>
-            </w:r>
-            <w:r>
-              <w:rPr>
-                <w:b/>
-                <w:sz w:val="24"/>
-                <w:szCs w:val="24"/>
-              </w:rPr>
+              <w:br/>
               <w:t>Pre-Activities:</w:t>
-            </w:r>
-            <w:r>
-              <w:rPr>
-                <w:sz w:val="24"/>
-                <w:szCs w:val="24"/>
-              </w:rPr>
-              <w:br/>
-            </w:r>
-            <w:r>
-              <w:rPr>
-                <w:b/>
-                <w:sz w:val="24"/>
-                <w:szCs w:val="24"/>
-              </w:rPr>
+              <w:br/>
               <w:t>Practice Keywords:</w:t>
-            </w:r>
-            <w:r>
-              <w:rPr>
-                <w:sz w:val="24"/>
-                <w:szCs w:val="24"/>
-              </w:rPr>
               <w:br/>
               <w:t>practice: work done to improve a skill</w:t>
-            </w:r>
-            <w:r>
-              <w:rPr>
-                <w:sz w:val="24"/>
-                <w:szCs w:val="24"/>
-              </w:rPr>
               <w:br/>
               <w:t>evidence: work that shows what you learned</w:t>
-            </w:r>
-            <w:r>
-              <w:rPr>
-                <w:sz w:val="24"/>
-                <w:szCs w:val="24"/>
-              </w:rPr>
-              <w:br/>
-              <w:t>Review the Week 9 debugging check.</w:t>
-            </w:r>
-            <w:r>
-              <w:rPr>
-                <w:sz w:val="24"/>
-                <w:szCs w:val="24"/>
-              </w:rPr>
+              <w:br/>
+              <w:t>Review the Week 9 formative debugging preparation.</w:t>
               <w:br/>
               <w:t>Choose one error type to practice again.</w:t>
-            </w:r>
-            <w:r>
-              <w:rPr>
-                <w:sz w:val="24"/>
-                <w:szCs w:val="24"/>
-              </w:rPr>
-              <w:br/>
-            </w:r>
-            <w:r>
-              <w:rPr>
-                <w:b/>
-                <w:sz w:val="24"/>
-                <w:szCs w:val="24"/>
-              </w:rPr>
+              <w:br/>
               <w:t>While-Activities:</w:t>
-            </w:r>
-            <w:r>
-              <w:rPr>
-                <w:sz w:val="24"/>
-                <w:szCs w:val="24"/>
-              </w:rPr>
               <w:br/>
               <w:t>Correct short if-then examples with a partner.</w:t>
-            </w:r>
-            <w:r>
-              <w:rPr>
-                <w:sz w:val="24"/>
-                <w:szCs w:val="24"/>
-              </w:rPr>
               <w:br/>
               <w:t>Create one new input-output example.</w:t>
-            </w:r>
-            <w:r>
-              <w:rPr>
-                <w:sz w:val="24"/>
-                <w:szCs w:val="24"/>
-              </w:rPr>
               <w:br/>
               <w:t>Explain why the corrected logic works.</w:t>
-            </w:r>
-            <w:r>
-              <w:rPr>
-                <w:sz w:val="24"/>
-                <w:szCs w:val="24"/>
-              </w:rPr>
-              <w:br/>
-            </w:r>
-            <w:r>
-              <w:rPr>
-                <w:b/>
-                <w:sz w:val="24"/>
-                <w:szCs w:val="24"/>
-              </w:rPr>
+              <w:br/>
               <w:t>Post-Activities:</w:t>
-            </w:r>
-            <w:r>
-              <w:rPr>
-                <w:sz w:val="24"/>
-                <w:szCs w:val="24"/>
-              </w:rPr>
               <w:br/>
               <w:t>Share one corrected example.</w:t>
-            </w:r>
-            <w:r>
-              <w:rPr>
-                <w:sz w:val="24"/>
-                <w:szCs w:val="24"/>
-              </w:rPr>
               <w:br/>
               <w:t>Write one debugging habit you want to keep using.</w:t>
-            </w:r>
-            <w:r>
-              <w:rPr>
-                <w:sz w:val="24"/>
-                <w:szCs w:val="24"/>
-              </w:rPr>
-              <w:br/>
-            </w:r>
-            <w:r>
-              <w:rPr>
-                <w:b/>
-                <w:sz w:val="24"/>
-                <w:szCs w:val="24"/>
-              </w:rPr>
+              <w:br/>
               <w:t>Resources:</w:t>
-            </w:r>
-            <w:r>
-              <w:rPr>
-                <w:sz w:val="24"/>
-                <w:szCs w:val="24"/>
-              </w:rPr>
               <w:br/>
               <w:t>notebook, logic cards, worksheet, paper fallback.</w:t>
+            </w:r>
+            <w:r>
+              <w:rPr>
+                <w:sz w:val="24"/>
+                <w:szCs w:val="24"/>
+              </w:rPr>
+            </w:r>
+            <w:r>
+              <w:rPr>
+                <w:sz w:val="24"/>
+                <w:szCs w:val="24"/>
+              </w:rPr>
+            </w:r>
+            <w:r>
+              <w:rPr>
+                <w:b/>
+                <w:sz w:val="24"/>
+                <w:szCs w:val="24"/>
+              </w:rPr>
+            </w:r>
+            <w:r>
+              <w:rPr>
+                <w:sz w:val="24"/>
+                <w:szCs w:val="24"/>
+              </w:rPr>
+            </w:r>
+            <w:r>
+              <w:rPr>
+                <w:b/>
+                <w:sz w:val="24"/>
+                <w:szCs w:val="24"/>
+              </w:rPr>
+            </w:r>
+            <w:r>
+              <w:rPr>
+                <w:sz w:val="24"/>
+                <w:szCs w:val="24"/>
+              </w:rPr>
+            </w:r>
+            <w:r>
+              <w:rPr>
+                <w:sz w:val="24"/>
+                <w:szCs w:val="24"/>
+              </w:rPr>
+            </w:r>
+            <w:r>
+              <w:rPr>
+                <w:sz w:val="24"/>
+                <w:szCs w:val="24"/>
+              </w:rPr>
+            </w:r>
+            <w:r>
+              <w:rPr>
+                <w:sz w:val="24"/>
+                <w:szCs w:val="24"/>
+              </w:rPr>
+            </w:r>
+            <w:r>
+              <w:rPr>
+                <w:sz w:val="24"/>
+                <w:szCs w:val="24"/>
+              </w:rPr>
+            </w:r>
+            <w:r>
+              <w:rPr>
+                <w:b/>
+                <w:sz w:val="24"/>
+                <w:szCs w:val="24"/>
+              </w:rPr>
+            </w:r>
+            <w:r>
+              <w:rPr>
+                <w:sz w:val="24"/>
+                <w:szCs w:val="24"/>
+              </w:rPr>
+            </w:r>
+            <w:r>
+              <w:rPr>
+                <w:sz w:val="24"/>
+                <w:szCs w:val="24"/>
+              </w:rPr>
+            </w:r>
+            <w:r>
+              <w:rPr>
+                <w:sz w:val="24"/>
+                <w:szCs w:val="24"/>
+              </w:rPr>
+            </w:r>
+            <w:r>
+              <w:rPr>
+                <w:sz w:val="24"/>
+                <w:szCs w:val="24"/>
+              </w:rPr>
+            </w:r>
+            <w:r>
+              <w:rPr>
+                <w:b/>
+                <w:sz w:val="24"/>
+                <w:szCs w:val="24"/>
+              </w:rPr>
+            </w:r>
+            <w:r>
+              <w:rPr>
+                <w:sz w:val="24"/>
+                <w:szCs w:val="24"/>
+              </w:rPr>
+            </w:r>
+            <w:r>
+              <w:rPr>
+                <w:sz w:val="24"/>
+                <w:szCs w:val="24"/>
+              </w:rPr>
+            </w:r>
+            <w:r>
+              <w:rPr>
+                <w:sz w:val="24"/>
+                <w:szCs w:val="24"/>
+              </w:rPr>
+            </w:r>
+            <w:r>
+              <w:rPr>
+                <w:b/>
+                <w:sz w:val="24"/>
+                <w:szCs w:val="24"/>
+              </w:rPr>
+            </w:r>
+            <w:r>
+              <w:rPr>
+                <w:sz w:val="24"/>
+                <w:szCs w:val="24"/>
+              </w:rPr>
             </w:r>
           </w:p>
         </w:tc>
@@ -1707,7 +1707,7 @@
               </w:rPr>
               <w:t>Topic:</w:t>
               <w:br/>
-              <w:t>Short Logic Demo</w:t>
+              <w:t>Interactive Routine STEM Project</w:t>
               <w:br/>
               <w:t>Pre-Activities:</w:t>
               <w:br/>
@@ -1723,15 +1723,13 @@
               <w:br/>
               <w:t>While-Activities:</w:t>
               <w:br/>
-              <w:t>Create a short paper, Scratch, or Blockly-style demo of your routine with one input, one condition, one output, and one test result.</w:t>
-              <w:br/>
-              <w:t>Test the demo with a partner.</w:t>
-              <w:br/>
-              <w:t>Record whether the output matched the condition.</w:t>
+              <w:t>Complete Summative Activity #5 (Summative): Create a short paper, Scratch, or Blockly-style Interactive Routine STEM Project with one input, one condition, one output, one test result, and one improvement note.</w:t>
+              <w:br/>
+              <w:t>Hardware is optional; paper, Scratch, or Blockly simulation is the default evidence.</w:t>
               <w:br/>
               <w:t>Post-Activities:</w:t>
               <w:br/>
-              <w:t>Present your logic demo to a small group.</w:t>
+              <w:t>Present your STEM routine to a small group.</w:t>
               <w:br/>
               <w:t>Write one change that made the routine clearer.</w:t>
               <w:br/>
@@ -2203,169 +2201,169 @@
                 <w:szCs w:val="24"/>
               </w:rPr>
               <w:t>Topic:</w:t>
-            </w:r>
-            <w:r>
-              <w:rPr>
-                <w:sz w:val="24"/>
-                <w:szCs w:val="24"/>
-              </w:rPr>
               <w:br/>
               <w:t>Make-Up and Evidence Workshop</w:t>
-            </w:r>
-            <w:r>
-              <w:rPr>
-                <w:sz w:val="24"/>
-                <w:szCs w:val="24"/>
-              </w:rPr>
-              <w:br/>
-            </w:r>
-            <w:r>
-              <w:rPr>
-                <w:b/>
-                <w:sz w:val="24"/>
-                <w:szCs w:val="24"/>
-              </w:rPr>
+              <w:br/>
               <w:t>Pre-Activities:</w:t>
-            </w:r>
-            <w:r>
-              <w:rPr>
-                <w:sz w:val="24"/>
-                <w:szCs w:val="24"/>
-              </w:rPr>
-              <w:br/>
-            </w:r>
-            <w:r>
-              <w:rPr>
-                <w:b/>
-                <w:sz w:val="24"/>
-                <w:szCs w:val="24"/>
-              </w:rPr>
+              <w:br/>
               <w:t>Practice Keywords:</w:t>
-            </w:r>
-            <w:r>
-              <w:rPr>
-                <w:sz w:val="24"/>
-                <w:szCs w:val="24"/>
-              </w:rPr>
               <w:br/>
               <w:t>evidence: work that shows what you learned</w:t>
-            </w:r>
-            <w:r>
-              <w:rPr>
-                <w:sz w:val="24"/>
-                <w:szCs w:val="24"/>
-              </w:rPr>
               <w:br/>
               <w:t>checklist: a list used to check finished work</w:t>
-            </w:r>
-            <w:r>
-              <w:rPr>
-                <w:sz w:val="24"/>
-                <w:szCs w:val="24"/>
-              </w:rPr>
               <w:br/>
               <w:t>Review your Trimester 2 evidence checklist.</w:t>
-            </w:r>
-            <w:r>
-              <w:rPr>
-                <w:sz w:val="24"/>
-                <w:szCs w:val="24"/>
-              </w:rPr>
               <w:br/>
               <w:t>Choose one missing or weak product to improve.</w:t>
-            </w:r>
-            <w:r>
-              <w:rPr>
-                <w:sz w:val="24"/>
-                <w:szCs w:val="24"/>
-              </w:rPr>
-              <w:br/>
-            </w:r>
-            <w:r>
-              <w:rPr>
-                <w:b/>
-                <w:sz w:val="24"/>
-                <w:szCs w:val="24"/>
-              </w:rPr>
+              <w:br/>
               <w:t>While-Activities:</w:t>
-            </w:r>
-            <w:r>
-              <w:rPr>
-                <w:sz w:val="24"/>
-                <w:szCs w:val="24"/>
-              </w:rPr>
-              <w:br/>
-              <w:t>Complete make-up work for systems, search, storyboard, visual product, or logic checks.</w:t>
-            </w:r>
-            <w:r>
-              <w:rPr>
-                <w:sz w:val="24"/>
-                <w:szCs w:val="24"/>
-              </w:rPr>
+              <w:br/>
+              <w:t>Complete make-up work for systems, search, storyboard, visual product, or the Interactive Routine STEM Project.</w:t>
               <w:br/>
               <w:t>Ask a peer to review one product with the checklist.</w:t>
-            </w:r>
-            <w:r>
-              <w:rPr>
-                <w:sz w:val="24"/>
-                <w:szCs w:val="24"/>
-              </w:rPr>
               <w:br/>
               <w:t>Revise one item before submitting.</w:t>
-            </w:r>
-            <w:r>
-              <w:rPr>
-                <w:sz w:val="24"/>
-                <w:szCs w:val="24"/>
-              </w:rPr>
-              <w:br/>
-            </w:r>
-            <w:r>
-              <w:rPr>
-                <w:b/>
-                <w:sz w:val="24"/>
-                <w:szCs w:val="24"/>
-              </w:rPr>
+              <w:br/>
               <w:t>Post-Activities:</w:t>
-            </w:r>
-            <w:r>
-              <w:rPr>
-                <w:sz w:val="24"/>
-                <w:szCs w:val="24"/>
-              </w:rPr>
               <w:br/>
               <w:t>Submit updated evidence.</w:t>
-            </w:r>
-            <w:r>
-              <w:rPr>
-                <w:sz w:val="24"/>
-                <w:szCs w:val="24"/>
-              </w:rPr>
               <w:br/>
               <w:t>Write one topic you understand better now.</w:t>
-            </w:r>
-            <w:r>
-              <w:rPr>
-                <w:sz w:val="24"/>
-                <w:szCs w:val="24"/>
-              </w:rPr>
-              <w:br/>
-            </w:r>
-            <w:r>
-              <w:rPr>
-                <w:b/>
-                <w:sz w:val="24"/>
-                <w:szCs w:val="24"/>
-              </w:rPr>
+              <w:br/>
               <w:t>Resources:</w:t>
-            </w:r>
-            <w:r>
-              <w:rPr>
-                <w:sz w:val="24"/>
-                <w:szCs w:val="24"/>
-              </w:rPr>
               <w:br/>
               <w:t>notebook, logic cards, worksheet, paper fallback.</w:t>
+            </w:r>
+            <w:r>
+              <w:rPr>
+                <w:sz w:val="24"/>
+                <w:szCs w:val="24"/>
+              </w:rPr>
+            </w:r>
+            <w:r>
+              <w:rPr>
+                <w:sz w:val="24"/>
+                <w:szCs w:val="24"/>
+              </w:rPr>
+            </w:r>
+            <w:r>
+              <w:rPr>
+                <w:b/>
+                <w:sz w:val="24"/>
+                <w:szCs w:val="24"/>
+              </w:rPr>
+            </w:r>
+            <w:r>
+              <w:rPr>
+                <w:sz w:val="24"/>
+                <w:szCs w:val="24"/>
+              </w:rPr>
+            </w:r>
+            <w:r>
+              <w:rPr>
+                <w:b/>
+                <w:sz w:val="24"/>
+                <w:szCs w:val="24"/>
+              </w:rPr>
+            </w:r>
+            <w:r>
+              <w:rPr>
+                <w:sz w:val="24"/>
+                <w:szCs w:val="24"/>
+              </w:rPr>
+            </w:r>
+            <w:r>
+              <w:rPr>
+                <w:sz w:val="24"/>
+                <w:szCs w:val="24"/>
+              </w:rPr>
+            </w:r>
+            <w:r>
+              <w:rPr>
+                <w:sz w:val="24"/>
+                <w:szCs w:val="24"/>
+              </w:rPr>
+            </w:r>
+            <w:r>
+              <w:rPr>
+                <w:sz w:val="24"/>
+                <w:szCs w:val="24"/>
+              </w:rPr>
+            </w:r>
+            <w:r>
+              <w:rPr>
+                <w:sz w:val="24"/>
+                <w:szCs w:val="24"/>
+              </w:rPr>
+            </w:r>
+            <w:r>
+              <w:rPr>
+                <w:b/>
+                <w:sz w:val="24"/>
+                <w:szCs w:val="24"/>
+              </w:rPr>
+            </w:r>
+            <w:r>
+              <w:rPr>
+                <w:sz w:val="24"/>
+                <w:szCs w:val="24"/>
+              </w:rPr>
+            </w:r>
+            <w:r>
+              <w:rPr>
+                <w:sz w:val="24"/>
+                <w:szCs w:val="24"/>
+              </w:rPr>
+            </w:r>
+            <w:r>
+              <w:rPr>
+                <w:sz w:val="24"/>
+                <w:szCs w:val="24"/>
+              </w:rPr>
+            </w:r>
+            <w:r>
+              <w:rPr>
+                <w:sz w:val="24"/>
+                <w:szCs w:val="24"/>
+              </w:rPr>
+            </w:r>
+            <w:r>
+              <w:rPr>
+                <w:b/>
+                <w:sz w:val="24"/>
+                <w:szCs w:val="24"/>
+              </w:rPr>
+            </w:r>
+            <w:r>
+              <w:rPr>
+                <w:sz w:val="24"/>
+                <w:szCs w:val="24"/>
+              </w:rPr>
+            </w:r>
+            <w:r>
+              <w:rPr>
+                <w:sz w:val="24"/>
+                <w:szCs w:val="24"/>
+              </w:rPr>
+            </w:r>
+            <w:r>
+              <w:rPr>
+                <w:sz w:val="24"/>
+                <w:szCs w:val="24"/>
+              </w:rPr>
+            </w:r>
+            <w:r>
+              <w:rPr>
+                <w:b/>
+                <w:sz w:val="24"/>
+                <w:szCs w:val="24"/>
+              </w:rPr>
+            </w:r>
+            <w:r>
+              <w:rPr>
+                <w:sz w:val="24"/>
+                <w:szCs w:val="24"/>
+              </w:rPr>
             </w:r>
           </w:p>
         </w:tc>

</xml_diff>